<commit_message>
commit 23.03 Signed-off-by: Yulia Mahonina <yulya.machonina@mail.ru>
</commit_message>
<xml_diff>
--- a/отчеты/lab_git_GUI_0.docx
+++ b/отчеты/lab_git_GUI_0.docx
@@ -1014,15 +1014,6 @@
           <w:szCs w:val="24"/>
         </w:rPr>
         <w:tab/>
-      </w:r>
-      <w:r>
-        <w:rPr>
-          <w:rFonts w:ascii="Times New Roman" w:hAnsi="Times New Roman" w:cs="Times New Roman"/>
-          <w:i/>
-          <w:iCs/>
-          <w:sz w:val="24"/>
-          <w:szCs w:val="24"/>
-        </w:rPr>
         <w:t>Установка Git, работа с Git GU</w:t>
       </w:r>
     </w:p>
@@ -1360,6 +1351,18 @@
       <w:pPr>
         <w:pStyle w:val="a3"/>
         <w:spacing w:after="0" w:line="300" w:lineRule="auto"/>
+        <w:ind w:left="927"/>
+        <w:rPr>
+          <w:rFonts w:ascii="Times New Roman" w:hAnsi="Times New Roman" w:cs="Times New Roman"/>
+          <w:sz w:val="24"/>
+          <w:szCs w:val="24"/>
+        </w:rPr>
+      </w:pPr>
+    </w:p>
+    <w:p>
+      <w:pPr>
+        <w:pStyle w:val="a3"/>
+        <w:spacing w:after="0" w:line="300" w:lineRule="auto"/>
         <w:ind w:left="927" w:hanging="927"/>
       </w:pPr>
       <w:r>
@@ -1420,24 +1423,309 @@
           <w:sz w:val="24"/>
           <w:szCs w:val="24"/>
         </w:rPr>
-        <w:t xml:space="preserve">Рисунок 1 – </w:t>
+        <w:t xml:space="preserve">Рисунок </w:t>
       </w:r>
       <w:r>
         <w:rPr>
           <w:rFonts w:ascii="Times New Roman" w:hAnsi="Times New Roman" w:cs="Times New Roman"/>
           <w:sz w:val="24"/>
           <w:szCs w:val="24"/>
-        </w:rPr>
-        <w:t>Папка хранилища</w:t>
-      </w:r>
-      <w:bookmarkStart w:id="0" w:name="_GoBack"/>
-      <w:bookmarkEnd w:id="0"/>
+          <w:lang w:val="en-US"/>
+        </w:rPr>
+        <w:t>2</w:t>
+      </w:r>
+      <w:r>
+        <w:rPr>
+          <w:rFonts w:ascii="Times New Roman" w:hAnsi="Times New Roman" w:cs="Times New Roman"/>
+          <w:sz w:val="24"/>
+          <w:szCs w:val="24"/>
+        </w:rPr>
+        <w:t xml:space="preserve"> – Папка хранилища</w:t>
+      </w:r>
+    </w:p>
+    <w:p>
+      <w:pPr>
+        <w:spacing w:after="0" w:line="300" w:lineRule="auto"/>
+        <w:ind w:left="219" w:firstLine="708"/>
+        <w:jc w:val="center"/>
+        <w:rPr>
+          <w:rFonts w:ascii="Times New Roman" w:hAnsi="Times New Roman" w:cs="Times New Roman"/>
+          <w:sz w:val="24"/>
+          <w:szCs w:val="24"/>
+        </w:rPr>
+      </w:pPr>
+    </w:p>
+    <w:p>
+      <w:pPr>
+        <w:spacing w:after="0" w:line="300" w:lineRule="auto"/>
+        <w:ind w:left="219" w:hanging="219"/>
+        <w:rPr>
+          <w:rFonts w:ascii="Times New Roman" w:hAnsi="Times New Roman" w:cs="Times New Roman"/>
+          <w:sz w:val="24"/>
+          <w:szCs w:val="24"/>
+        </w:rPr>
+      </w:pPr>
+      <w:r>
+        <w:rPr>
+          <w:noProof/>
+        </w:rPr>
+        <w:drawing>
+          <wp:inline distT="0" distB="0" distL="0" distR="0" wp14:anchorId="340D2875" wp14:editId="77D5D609">
+            <wp:extent cx="5940425" cy="3305175"/>
+            <wp:effectExtent l="0" t="0" r="3175" b="9525"/>
+            <wp:docPr id="1542389717" name="Рисунок 1"/>
+            <wp:cNvGraphicFramePr>
+              <a:graphicFrameLocks xmlns:a="http://schemas.openxmlformats.org/drawingml/2006/main" noChangeAspect="1"/>
+            </wp:cNvGraphicFramePr>
+            <a:graphic xmlns:a="http://schemas.openxmlformats.org/drawingml/2006/main">
+              <a:graphicData uri="http://schemas.openxmlformats.org/drawingml/2006/picture">
+                <pic:pic xmlns:pic="http://schemas.openxmlformats.org/drawingml/2006/picture">
+                  <pic:nvPicPr>
+                    <pic:cNvPr id="1542389717" name=""/>
+                    <pic:cNvPicPr/>
+                  </pic:nvPicPr>
+                  <pic:blipFill>
+                    <a:blip r:embed="rId10"/>
+                    <a:stretch>
+                      <a:fillRect/>
+                    </a:stretch>
+                  </pic:blipFill>
+                  <pic:spPr>
+                    <a:xfrm>
+                      <a:off x="0" y="0"/>
+                      <a:ext cx="5940425" cy="3305175"/>
+                    </a:xfrm>
+                    <a:prstGeom prst="rect">
+                      <a:avLst/>
+                    </a:prstGeom>
+                  </pic:spPr>
+                </pic:pic>
+              </a:graphicData>
+            </a:graphic>
+          </wp:inline>
+        </w:drawing>
+      </w:r>
+    </w:p>
+    <w:p>
+      <w:pPr>
+        <w:spacing w:after="0" w:line="300" w:lineRule="auto"/>
+        <w:ind w:left="219" w:firstLine="708"/>
+        <w:jc w:val="center"/>
+        <w:rPr>
+          <w:rFonts w:ascii="Times New Roman" w:hAnsi="Times New Roman" w:cs="Times New Roman"/>
+          <w:sz w:val="24"/>
+          <w:szCs w:val="24"/>
+        </w:rPr>
+      </w:pPr>
+      <w:r>
+        <w:rPr>
+          <w:rFonts w:ascii="Times New Roman" w:hAnsi="Times New Roman" w:cs="Times New Roman"/>
+          <w:sz w:val="24"/>
+          <w:szCs w:val="24"/>
+        </w:rPr>
+        <w:t xml:space="preserve">Рисунок </w:t>
+      </w:r>
+      <w:r>
+        <w:rPr>
+          <w:rFonts w:ascii="Times New Roman" w:hAnsi="Times New Roman" w:cs="Times New Roman"/>
+          <w:sz w:val="24"/>
+          <w:szCs w:val="24"/>
+        </w:rPr>
+        <w:t>3</w:t>
+      </w:r>
+      <w:r>
+        <w:rPr>
+          <w:rFonts w:ascii="Times New Roman" w:hAnsi="Times New Roman" w:cs="Times New Roman"/>
+          <w:sz w:val="24"/>
+          <w:szCs w:val="24"/>
+        </w:rPr>
+        <w:t xml:space="preserve"> – Главный интерфейс</w:t>
+      </w:r>
+    </w:p>
+    <w:p>
+      <w:pPr>
+        <w:spacing w:after="0" w:line="300" w:lineRule="auto"/>
+        <w:ind w:left="219" w:hanging="219"/>
+        <w:rPr>
+          <w:rFonts w:ascii="Times New Roman" w:hAnsi="Times New Roman" w:cs="Times New Roman"/>
+          <w:sz w:val="24"/>
+          <w:szCs w:val="24"/>
+        </w:rPr>
+      </w:pPr>
+    </w:p>
+    <w:p>
+      <w:pPr>
+        <w:spacing w:after="0" w:line="300" w:lineRule="auto"/>
+        <w:ind w:left="219" w:firstLine="708"/>
+        <w:jc w:val="center"/>
+        <w:rPr>
+          <w:rFonts w:ascii="Times New Roman" w:hAnsi="Times New Roman" w:cs="Times New Roman"/>
+          <w:sz w:val="24"/>
+          <w:szCs w:val="24"/>
+        </w:rPr>
+      </w:pPr>
+    </w:p>
+    <w:p>
+      <w:pPr>
+        <w:pStyle w:val="a3"/>
+        <w:pageBreakBefore/>
+        <w:numPr>
+          <w:ilvl w:val="0"/>
+          <w:numId w:val="32"/>
+        </w:numPr>
+        <w:spacing w:after="0" w:line="300" w:lineRule="auto"/>
+        <w:ind w:left="924" w:hanging="357"/>
+        <w:rPr>
+          <w:rFonts w:ascii="Times New Roman" w:hAnsi="Times New Roman" w:cs="Times New Roman"/>
+          <w:sz w:val="24"/>
+          <w:szCs w:val="24"/>
+        </w:rPr>
+      </w:pPr>
+      <w:r>
+        <w:rPr>
+          <w:rFonts w:ascii="Times New Roman" w:hAnsi="Times New Roman" w:cs="Times New Roman"/>
+          <w:sz w:val="24"/>
+          <w:szCs w:val="24"/>
+        </w:rPr>
+        <w:lastRenderedPageBreak/>
+        <w:t>Закрепление изменений (commiting)</w:t>
+      </w:r>
+    </w:p>
+    <w:p>
+      <w:pPr>
+        <w:pStyle w:val="a3"/>
+        <w:spacing w:after="0" w:line="300" w:lineRule="auto"/>
+        <w:ind w:left="927"/>
+        <w:rPr>
+          <w:rFonts w:ascii="Times New Roman" w:hAnsi="Times New Roman" w:cs="Times New Roman"/>
+          <w:sz w:val="24"/>
+          <w:szCs w:val="24"/>
+        </w:rPr>
+      </w:pPr>
+    </w:p>
+    <w:p>
+      <w:pPr>
+        <w:pStyle w:val="a3"/>
+        <w:spacing w:after="0" w:line="300" w:lineRule="auto"/>
+        <w:ind w:left="0" w:firstLine="567"/>
+        <w:rPr>
+          <w:rFonts w:ascii="Times New Roman" w:hAnsi="Times New Roman" w:cs="Times New Roman"/>
+          <w:sz w:val="24"/>
+          <w:szCs w:val="24"/>
+        </w:rPr>
+      </w:pPr>
+      <w:r>
+        <w:rPr>
+          <w:rFonts w:ascii="Times New Roman" w:hAnsi="Times New Roman" w:cs="Times New Roman"/>
+          <w:sz w:val="24"/>
+          <w:szCs w:val="24"/>
+        </w:rPr>
+        <w:t>Хранилище создано, поэтому теперь в папке создается текстовый файл с некоторым содержанием.  Редактирование было выполнено в блокноте. После нажатия кнопки «</w:t>
+      </w:r>
+      <w:r>
+        <w:rPr>
+          <w:rFonts w:ascii="Times New Roman" w:hAnsi="Times New Roman" w:cs="Times New Roman"/>
+          <w:sz w:val="24"/>
+          <w:szCs w:val="24"/>
+          <w:lang w:val="en-US"/>
+        </w:rPr>
+        <w:t>Rescan</w:t>
+      </w:r>
+      <w:r>
+        <w:rPr>
+          <w:rFonts w:ascii="Times New Roman" w:hAnsi="Times New Roman" w:cs="Times New Roman"/>
+          <w:sz w:val="24"/>
+          <w:szCs w:val="24"/>
+        </w:rPr>
+        <w:t>» мы получили следующее:</w:t>
+      </w:r>
+    </w:p>
+    <w:p>
+      <w:pPr>
+        <w:pStyle w:val="a3"/>
+        <w:spacing w:after="0" w:line="300" w:lineRule="auto"/>
+        <w:ind w:left="0" w:firstLine="567"/>
+        <w:rPr>
+          <w:rFonts w:ascii="Times New Roman" w:hAnsi="Times New Roman" w:cs="Times New Roman"/>
+          <w:sz w:val="24"/>
+          <w:szCs w:val="24"/>
+        </w:rPr>
+      </w:pPr>
     </w:p>
     <w:p>
       <w:pPr>
         <w:pStyle w:val="a3"/>
         <w:spacing w:after="0" w:line="300" w:lineRule="auto"/>
         <w:ind w:left="927" w:hanging="927"/>
+        <w:rPr>
+          <w:rFonts w:ascii="Times New Roman" w:hAnsi="Times New Roman" w:cs="Times New Roman"/>
+          <w:sz w:val="24"/>
+          <w:szCs w:val="24"/>
+        </w:rPr>
+      </w:pPr>
+      <w:r>
+        <w:rPr>
+          <w:noProof/>
+        </w:rPr>
+        <w:drawing>
+          <wp:inline distT="0" distB="0" distL="0" distR="0" wp14:anchorId="75D3D94F" wp14:editId="21A7BAB4">
+            <wp:extent cx="6120130" cy="3665855"/>
+            <wp:effectExtent l="0" t="0" r="0" b="0"/>
+            <wp:docPr id="4" name="Рисунок 4"/>
+            <wp:cNvGraphicFramePr>
+              <a:graphicFrameLocks xmlns:a="http://schemas.openxmlformats.org/drawingml/2006/main" noChangeAspect="1"/>
+            </wp:cNvGraphicFramePr>
+            <a:graphic xmlns:a="http://schemas.openxmlformats.org/drawingml/2006/main">
+              <a:graphicData uri="http://schemas.openxmlformats.org/drawingml/2006/picture">
+                <pic:pic xmlns:pic="http://schemas.openxmlformats.org/drawingml/2006/picture">
+                  <pic:nvPicPr>
+                    <pic:cNvPr id="1" name=""/>
+                    <pic:cNvPicPr/>
+                  </pic:nvPicPr>
+                  <pic:blipFill>
+                    <a:blip r:embed="rId11"/>
+                    <a:stretch>
+                      <a:fillRect/>
+                    </a:stretch>
+                  </pic:blipFill>
+                  <pic:spPr>
+                    <a:xfrm>
+                      <a:off x="0" y="0"/>
+                      <a:ext cx="6120130" cy="3665855"/>
+                    </a:xfrm>
+                    <a:prstGeom prst="rect">
+                      <a:avLst/>
+                    </a:prstGeom>
+                  </pic:spPr>
+                </pic:pic>
+              </a:graphicData>
+            </a:graphic>
+          </wp:inline>
+        </w:drawing>
+      </w:r>
+    </w:p>
+    <w:p>
+      <w:pPr>
+        <w:pStyle w:val="a3"/>
+        <w:spacing w:after="0" w:line="300" w:lineRule="auto"/>
+        <w:ind w:left="927" w:hanging="927"/>
+        <w:rPr>
+          <w:rFonts w:ascii="Times New Roman" w:hAnsi="Times New Roman" w:cs="Times New Roman"/>
+          <w:sz w:val="24"/>
+          <w:szCs w:val="24"/>
+        </w:rPr>
+      </w:pPr>
+    </w:p>
+    <w:p>
+      <w:pPr>
+        <w:pStyle w:val="a3"/>
+        <w:spacing w:after="0" w:line="300" w:lineRule="auto"/>
+        <w:ind w:left="927" w:hanging="927"/>
+        <w:rPr>
+          <w:rFonts w:ascii="Times New Roman" w:hAnsi="Times New Roman" w:cs="Times New Roman"/>
+          <w:sz w:val="24"/>
+          <w:szCs w:val="24"/>
+        </w:rPr>
       </w:pPr>
     </w:p>
     <w:p>
@@ -1450,9 +1738,1315 @@
           <w:lang w:eastAsia="ru-RU"/>
         </w:rPr>
       </w:pPr>
+      <w:r>
+        <w:rPr>
+          <w:rFonts w:ascii="Times New Roman" w:eastAsia="Times New Roman" w:hAnsi="Times New Roman" w:cs="Times New Roman"/>
+          <w:sz w:val="26"/>
+          <w:szCs w:val="26"/>
+          <w:lang w:eastAsia="ru-RU"/>
+        </w:rPr>
+        <w:t>Перенесем файл в нижнее окно:</w:t>
+      </w:r>
+    </w:p>
+    <w:p>
+      <w:pPr>
+        <w:spacing w:after="0" w:line="276" w:lineRule="auto"/>
+        <w:jc w:val="center"/>
+        <w:rPr>
+          <w:rFonts w:ascii="Times New Roman" w:eastAsia="Times New Roman" w:hAnsi="Times New Roman" w:cs="Times New Roman"/>
+          <w:sz w:val="26"/>
+          <w:szCs w:val="26"/>
+          <w:lang w:eastAsia="ru-RU"/>
+        </w:rPr>
+      </w:pPr>
+      <w:r>
+        <w:rPr>
+          <w:noProof/>
+        </w:rPr>
+        <w:drawing>
+          <wp:inline distT="0" distB="0" distL="0" distR="0" wp14:anchorId="4F28FD8E" wp14:editId="63A9F13B">
+            <wp:extent cx="5584764" cy="3345180"/>
+            <wp:effectExtent l="0" t="0" r="0" b="7620"/>
+            <wp:docPr id="3" name="Рисунок 3"/>
+            <wp:cNvGraphicFramePr>
+              <a:graphicFrameLocks xmlns:a="http://schemas.openxmlformats.org/drawingml/2006/main" noChangeAspect="1"/>
+            </wp:cNvGraphicFramePr>
+            <a:graphic xmlns:a="http://schemas.openxmlformats.org/drawingml/2006/main">
+              <a:graphicData uri="http://schemas.openxmlformats.org/drawingml/2006/picture">
+                <pic:pic xmlns:pic="http://schemas.openxmlformats.org/drawingml/2006/picture">
+                  <pic:nvPicPr>
+                    <pic:cNvPr id="1" name=""/>
+                    <pic:cNvPicPr/>
+                  </pic:nvPicPr>
+                  <pic:blipFill>
+                    <a:blip r:embed="rId12"/>
+                    <a:stretch>
+                      <a:fillRect/>
+                    </a:stretch>
+                  </pic:blipFill>
+                  <pic:spPr>
+                    <a:xfrm>
+                      <a:off x="0" y="0"/>
+                      <a:ext cx="5606407" cy="3358144"/>
+                    </a:xfrm>
+                    <a:prstGeom prst="rect">
+                      <a:avLst/>
+                    </a:prstGeom>
+                  </pic:spPr>
+                </pic:pic>
+              </a:graphicData>
+            </a:graphic>
+          </wp:inline>
+        </w:drawing>
+      </w:r>
+    </w:p>
+    <w:p>
+      <w:pPr>
+        <w:spacing w:after="0" w:line="276" w:lineRule="auto"/>
+        <w:ind w:firstLine="567"/>
+        <w:rPr>
+          <w:rFonts w:ascii="Times New Roman" w:eastAsia="Times New Roman" w:hAnsi="Times New Roman" w:cs="Times New Roman"/>
+          <w:sz w:val="26"/>
+          <w:szCs w:val="26"/>
+          <w:lang w:eastAsia="ru-RU"/>
+        </w:rPr>
+      </w:pPr>
+      <w:r>
+        <w:rPr>
+          <w:rFonts w:ascii="Times New Roman" w:eastAsia="Times New Roman" w:hAnsi="Times New Roman" w:cs="Times New Roman"/>
+          <w:sz w:val="26"/>
+          <w:szCs w:val="26"/>
+          <w:lang w:eastAsia="ru-RU"/>
+        </w:rPr>
+        <w:lastRenderedPageBreak/>
+        <w:t xml:space="preserve">И введя текст коммита, нажмем на кнопку </w:t>
+      </w:r>
+      <w:r>
+        <w:rPr>
+          <w:rFonts w:ascii="Times New Roman" w:eastAsia="Times New Roman" w:hAnsi="Times New Roman" w:cs="Times New Roman"/>
+          <w:sz w:val="26"/>
+          <w:szCs w:val="26"/>
+          <w:lang w:eastAsia="ru-RU"/>
+        </w:rPr>
+        <w:t>“</w:t>
+      </w:r>
+      <w:r>
+        <w:rPr>
+          <w:rFonts w:ascii="Times New Roman" w:eastAsia="Times New Roman" w:hAnsi="Times New Roman" w:cs="Times New Roman"/>
+          <w:sz w:val="26"/>
+          <w:szCs w:val="26"/>
+          <w:lang w:val="en-US" w:eastAsia="ru-RU"/>
+        </w:rPr>
+        <w:t>Commit</w:t>
+      </w:r>
+      <w:r>
+        <w:rPr>
+          <w:rFonts w:ascii="Times New Roman" w:eastAsia="Times New Roman" w:hAnsi="Times New Roman" w:cs="Times New Roman"/>
+          <w:sz w:val="26"/>
+          <w:szCs w:val="26"/>
+          <w:lang w:eastAsia="ru-RU"/>
+        </w:rPr>
+        <w:t>”.</w:t>
+      </w:r>
+    </w:p>
+    <w:p>
+      <w:pPr>
+        <w:spacing w:after="0" w:line="276" w:lineRule="auto"/>
+        <w:rPr>
+          <w:rFonts w:ascii="Times New Roman" w:eastAsia="Times New Roman" w:hAnsi="Times New Roman" w:cs="Times New Roman"/>
+          <w:sz w:val="26"/>
+          <w:szCs w:val="26"/>
+          <w:lang w:eastAsia="ru-RU"/>
+        </w:rPr>
+      </w:pPr>
+    </w:p>
+    <w:p>
+      <w:pPr>
+        <w:pStyle w:val="a3"/>
+        <w:numPr>
+          <w:ilvl w:val="0"/>
+          <w:numId w:val="32"/>
+        </w:numPr>
+        <w:spacing w:after="0" w:line="276" w:lineRule="auto"/>
+        <w:rPr>
+          <w:rFonts w:ascii="Times New Roman" w:eastAsia="Times New Roman" w:hAnsi="Times New Roman" w:cs="Times New Roman"/>
+          <w:sz w:val="26"/>
+          <w:szCs w:val="26"/>
+          <w:lang w:eastAsia="ru-RU"/>
+        </w:rPr>
+      </w:pPr>
+      <w:r>
+        <w:rPr>
+          <w:rFonts w:ascii="Times New Roman" w:eastAsia="Times New Roman" w:hAnsi="Times New Roman" w:cs="Times New Roman"/>
+          <w:sz w:val="26"/>
+          <w:szCs w:val="26"/>
+          <w:lang w:eastAsia="ru-RU"/>
+        </w:rPr>
+        <w:t>Ветвление</w:t>
+      </w:r>
+    </w:p>
+    <w:p>
+      <w:pPr>
+        <w:pStyle w:val="a3"/>
+        <w:spacing w:after="0" w:line="276" w:lineRule="auto"/>
+        <w:ind w:left="927"/>
+        <w:rPr>
+          <w:rFonts w:ascii="Times New Roman" w:eastAsia="Times New Roman" w:hAnsi="Times New Roman" w:cs="Times New Roman"/>
+          <w:sz w:val="26"/>
+          <w:szCs w:val="26"/>
+          <w:lang w:eastAsia="ru-RU"/>
+        </w:rPr>
+      </w:pPr>
+    </w:p>
+    <w:p>
+      <w:pPr>
+        <w:pStyle w:val="a3"/>
+        <w:spacing w:after="0" w:line="276" w:lineRule="auto"/>
+        <w:ind w:left="927" w:hanging="927"/>
+        <w:rPr>
+          <w:rFonts w:ascii="Times New Roman" w:eastAsia="Times New Roman" w:hAnsi="Times New Roman" w:cs="Times New Roman"/>
+          <w:sz w:val="26"/>
+          <w:szCs w:val="26"/>
+          <w:lang w:eastAsia="ru-RU"/>
+        </w:rPr>
+      </w:pPr>
+      <w:r>
+        <w:rPr>
+          <w:noProof/>
+        </w:rPr>
+        <w:drawing>
+          <wp:inline distT="0" distB="0" distL="0" distR="0" wp14:anchorId="3E71D810" wp14:editId="307AB3AE">
+            <wp:extent cx="5940425" cy="3089275"/>
+            <wp:effectExtent l="0" t="0" r="3175" b="0"/>
+            <wp:docPr id="719531166" name="Рисунок 1"/>
+            <wp:cNvGraphicFramePr>
+              <a:graphicFrameLocks xmlns:a="http://schemas.openxmlformats.org/drawingml/2006/main" noChangeAspect="1"/>
+            </wp:cNvGraphicFramePr>
+            <a:graphic xmlns:a="http://schemas.openxmlformats.org/drawingml/2006/main">
+              <a:graphicData uri="http://schemas.openxmlformats.org/drawingml/2006/picture">
+                <pic:pic xmlns:pic="http://schemas.openxmlformats.org/drawingml/2006/picture">
+                  <pic:nvPicPr>
+                    <pic:cNvPr id="719531166" name=""/>
+                    <pic:cNvPicPr/>
+                  </pic:nvPicPr>
+                  <pic:blipFill>
+                    <a:blip r:embed="rId13"/>
+                    <a:stretch>
+                      <a:fillRect/>
+                    </a:stretch>
+                  </pic:blipFill>
+                  <pic:spPr>
+                    <a:xfrm>
+                      <a:off x="0" y="0"/>
+                      <a:ext cx="5940425" cy="3089275"/>
+                    </a:xfrm>
+                    <a:prstGeom prst="rect">
+                      <a:avLst/>
+                    </a:prstGeom>
+                  </pic:spPr>
+                </pic:pic>
+              </a:graphicData>
+            </a:graphic>
+          </wp:inline>
+        </w:drawing>
+      </w:r>
+    </w:p>
+    <w:p>
+      <w:pPr>
+        <w:pStyle w:val="a3"/>
+        <w:spacing w:after="0" w:line="276" w:lineRule="auto"/>
+        <w:ind w:left="927" w:hanging="927"/>
+        <w:rPr>
+          <w:rFonts w:ascii="Times New Roman" w:eastAsia="Times New Roman" w:hAnsi="Times New Roman" w:cs="Times New Roman"/>
+          <w:sz w:val="26"/>
+          <w:szCs w:val="26"/>
+          <w:lang w:eastAsia="ru-RU"/>
+        </w:rPr>
+      </w:pPr>
+      <w:r>
+        <w:rPr>
+          <w:noProof/>
+        </w:rPr>
+        <w:drawing>
+          <wp:inline distT="0" distB="0" distL="0" distR="0" wp14:anchorId="5452ACA9" wp14:editId="02B6A5F1">
+            <wp:extent cx="5940425" cy="3505835"/>
+            <wp:effectExtent l="0" t="0" r="3175" b="0"/>
+            <wp:docPr id="243016106" name="Рисунок 1"/>
+            <wp:cNvGraphicFramePr>
+              <a:graphicFrameLocks xmlns:a="http://schemas.openxmlformats.org/drawingml/2006/main" noChangeAspect="1"/>
+            </wp:cNvGraphicFramePr>
+            <a:graphic xmlns:a="http://schemas.openxmlformats.org/drawingml/2006/main">
+              <a:graphicData uri="http://schemas.openxmlformats.org/drawingml/2006/picture">
+                <pic:pic xmlns:pic="http://schemas.openxmlformats.org/drawingml/2006/picture">
+                  <pic:nvPicPr>
+                    <pic:cNvPr id="243016106" name=""/>
+                    <pic:cNvPicPr/>
+                  </pic:nvPicPr>
+                  <pic:blipFill>
+                    <a:blip r:embed="rId14"/>
+                    <a:stretch>
+                      <a:fillRect/>
+                    </a:stretch>
+                  </pic:blipFill>
+                  <pic:spPr>
+                    <a:xfrm>
+                      <a:off x="0" y="0"/>
+                      <a:ext cx="5940425" cy="3505835"/>
+                    </a:xfrm>
+                    <a:prstGeom prst="rect">
+                      <a:avLst/>
+                    </a:prstGeom>
+                  </pic:spPr>
+                </pic:pic>
+              </a:graphicData>
+            </a:graphic>
+          </wp:inline>
+        </w:drawing>
+      </w:r>
+    </w:p>
+    <w:p>
+      <w:pPr>
+        <w:pStyle w:val="a3"/>
+        <w:spacing w:after="0" w:line="276" w:lineRule="auto"/>
+        <w:ind w:left="927" w:hanging="927"/>
+        <w:rPr>
+          <w:rFonts w:ascii="Times New Roman" w:eastAsia="Times New Roman" w:hAnsi="Times New Roman" w:cs="Times New Roman"/>
+          <w:sz w:val="26"/>
+          <w:szCs w:val="26"/>
+          <w:lang w:eastAsia="ru-RU"/>
+        </w:rPr>
+      </w:pPr>
+      <w:r>
+        <w:rPr>
+          <w:noProof/>
+        </w:rPr>
+        <w:lastRenderedPageBreak/>
+        <w:drawing>
+          <wp:inline distT="0" distB="0" distL="0" distR="0" wp14:anchorId="5845A02F" wp14:editId="021F01C5">
+            <wp:extent cx="5940425" cy="3305175"/>
+            <wp:effectExtent l="0" t="0" r="3175" b="9525"/>
+            <wp:docPr id="191616666" name="Рисунок 1"/>
+            <wp:cNvGraphicFramePr>
+              <a:graphicFrameLocks xmlns:a="http://schemas.openxmlformats.org/drawingml/2006/main" noChangeAspect="1"/>
+            </wp:cNvGraphicFramePr>
+            <a:graphic xmlns:a="http://schemas.openxmlformats.org/drawingml/2006/main">
+              <a:graphicData uri="http://schemas.openxmlformats.org/drawingml/2006/picture">
+                <pic:pic xmlns:pic="http://schemas.openxmlformats.org/drawingml/2006/picture">
+                  <pic:nvPicPr>
+                    <pic:cNvPr id="191616666" name=""/>
+                    <pic:cNvPicPr/>
+                  </pic:nvPicPr>
+                  <pic:blipFill>
+                    <a:blip r:embed="rId15"/>
+                    <a:stretch>
+                      <a:fillRect/>
+                    </a:stretch>
+                  </pic:blipFill>
+                  <pic:spPr>
+                    <a:xfrm>
+                      <a:off x="0" y="0"/>
+                      <a:ext cx="5940425" cy="3305175"/>
+                    </a:xfrm>
+                    <a:prstGeom prst="rect">
+                      <a:avLst/>
+                    </a:prstGeom>
+                  </pic:spPr>
+                </pic:pic>
+              </a:graphicData>
+            </a:graphic>
+          </wp:inline>
+        </w:drawing>
+      </w:r>
+    </w:p>
+    <w:p>
+      <w:pPr>
+        <w:pStyle w:val="a3"/>
+        <w:spacing w:after="0" w:line="276" w:lineRule="auto"/>
+        <w:ind w:left="927" w:hanging="927"/>
+        <w:rPr>
+          <w:rFonts w:ascii="Times New Roman" w:eastAsia="Times New Roman" w:hAnsi="Times New Roman" w:cs="Times New Roman"/>
+          <w:sz w:val="26"/>
+          <w:szCs w:val="26"/>
+          <w:lang w:eastAsia="ru-RU"/>
+        </w:rPr>
+      </w:pPr>
+      <w:r>
+        <w:rPr>
+          <w:noProof/>
+        </w:rPr>
+        <w:drawing>
+          <wp:inline distT="0" distB="0" distL="0" distR="0" wp14:anchorId="443362C3" wp14:editId="0260A6FD">
+            <wp:extent cx="5940425" cy="948055"/>
+            <wp:effectExtent l="0" t="0" r="3175" b="4445"/>
+            <wp:docPr id="1106085947" name="Рисунок 1"/>
+            <wp:cNvGraphicFramePr>
+              <a:graphicFrameLocks xmlns:a="http://schemas.openxmlformats.org/drawingml/2006/main" noChangeAspect="1"/>
+            </wp:cNvGraphicFramePr>
+            <a:graphic xmlns:a="http://schemas.openxmlformats.org/drawingml/2006/main">
+              <a:graphicData uri="http://schemas.openxmlformats.org/drawingml/2006/picture">
+                <pic:pic xmlns:pic="http://schemas.openxmlformats.org/drawingml/2006/picture">
+                  <pic:nvPicPr>
+                    <pic:cNvPr id="1106085947" name=""/>
+                    <pic:cNvPicPr/>
+                  </pic:nvPicPr>
+                  <pic:blipFill>
+                    <a:blip r:embed="rId16"/>
+                    <a:stretch>
+                      <a:fillRect/>
+                    </a:stretch>
+                  </pic:blipFill>
+                  <pic:spPr>
+                    <a:xfrm>
+                      <a:off x="0" y="0"/>
+                      <a:ext cx="5940425" cy="948055"/>
+                    </a:xfrm>
+                    <a:prstGeom prst="rect">
+                      <a:avLst/>
+                    </a:prstGeom>
+                  </pic:spPr>
+                </pic:pic>
+              </a:graphicData>
+            </a:graphic>
+          </wp:inline>
+        </w:drawing>
+      </w:r>
+    </w:p>
+    <w:p>
+      <w:pPr>
+        <w:pStyle w:val="a3"/>
+        <w:spacing w:after="0" w:line="276" w:lineRule="auto"/>
+        <w:ind w:left="927" w:hanging="927"/>
+        <w:rPr>
+          <w:rFonts w:ascii="Times New Roman" w:eastAsia="Times New Roman" w:hAnsi="Times New Roman" w:cs="Times New Roman"/>
+          <w:sz w:val="26"/>
+          <w:szCs w:val="26"/>
+          <w:lang w:eastAsia="ru-RU"/>
+        </w:rPr>
+      </w:pPr>
+      <w:r>
+        <w:rPr>
+          <w:noProof/>
+        </w:rPr>
+        <w:drawing>
+          <wp:inline distT="0" distB="0" distL="0" distR="0" wp14:anchorId="10649E66" wp14:editId="7F1D5604">
+            <wp:extent cx="4450466" cy="3101609"/>
+            <wp:effectExtent l="0" t="0" r="7620" b="3810"/>
+            <wp:docPr id="589703447" name="Рисунок 1"/>
+            <wp:cNvGraphicFramePr>
+              <a:graphicFrameLocks xmlns:a="http://schemas.openxmlformats.org/drawingml/2006/main" noChangeAspect="1"/>
+            </wp:cNvGraphicFramePr>
+            <a:graphic xmlns:a="http://schemas.openxmlformats.org/drawingml/2006/main">
+              <a:graphicData uri="http://schemas.openxmlformats.org/drawingml/2006/picture">
+                <pic:pic xmlns:pic="http://schemas.openxmlformats.org/drawingml/2006/picture">
+                  <pic:nvPicPr>
+                    <pic:cNvPr id="589703447" name=""/>
+                    <pic:cNvPicPr/>
+                  </pic:nvPicPr>
+                  <pic:blipFill>
+                    <a:blip r:embed="rId17"/>
+                    <a:stretch>
+                      <a:fillRect/>
+                    </a:stretch>
+                  </pic:blipFill>
+                  <pic:spPr>
+                    <a:xfrm>
+                      <a:off x="0" y="0"/>
+                      <a:ext cx="4450466" cy="3101609"/>
+                    </a:xfrm>
+                    <a:prstGeom prst="rect">
+                      <a:avLst/>
+                    </a:prstGeom>
+                  </pic:spPr>
+                </pic:pic>
+              </a:graphicData>
+            </a:graphic>
+          </wp:inline>
+        </w:drawing>
+      </w:r>
+    </w:p>
+    <w:p>
+      <w:pPr>
+        <w:pStyle w:val="a3"/>
+        <w:spacing w:after="0" w:line="276" w:lineRule="auto"/>
+        <w:ind w:left="927" w:hanging="927"/>
+        <w:rPr>
+          <w:rFonts w:ascii="Times New Roman" w:eastAsia="Times New Roman" w:hAnsi="Times New Roman" w:cs="Times New Roman"/>
+          <w:sz w:val="26"/>
+          <w:szCs w:val="26"/>
+          <w:lang w:eastAsia="ru-RU"/>
+        </w:rPr>
+      </w:pPr>
+      <w:r>
+        <w:rPr>
+          <w:noProof/>
+        </w:rPr>
+        <w:lastRenderedPageBreak/>
+        <w:drawing>
+          <wp:inline distT="0" distB="0" distL="0" distR="0" wp14:anchorId="149645AB" wp14:editId="63FB5ED3">
+            <wp:extent cx="5940425" cy="2509520"/>
+            <wp:effectExtent l="0" t="0" r="3175" b="5080"/>
+            <wp:docPr id="1549687198" name="Рисунок 1"/>
+            <wp:cNvGraphicFramePr>
+              <a:graphicFrameLocks xmlns:a="http://schemas.openxmlformats.org/drawingml/2006/main" noChangeAspect="1"/>
+            </wp:cNvGraphicFramePr>
+            <a:graphic xmlns:a="http://schemas.openxmlformats.org/drawingml/2006/main">
+              <a:graphicData uri="http://schemas.openxmlformats.org/drawingml/2006/picture">
+                <pic:pic xmlns:pic="http://schemas.openxmlformats.org/drawingml/2006/picture">
+                  <pic:nvPicPr>
+                    <pic:cNvPr id="1549687198" name=""/>
+                    <pic:cNvPicPr/>
+                  </pic:nvPicPr>
+                  <pic:blipFill>
+                    <a:blip r:embed="rId18"/>
+                    <a:stretch>
+                      <a:fillRect/>
+                    </a:stretch>
+                  </pic:blipFill>
+                  <pic:spPr>
+                    <a:xfrm>
+                      <a:off x="0" y="0"/>
+                      <a:ext cx="5940425" cy="2509520"/>
+                    </a:xfrm>
+                    <a:prstGeom prst="rect">
+                      <a:avLst/>
+                    </a:prstGeom>
+                  </pic:spPr>
+                </pic:pic>
+              </a:graphicData>
+            </a:graphic>
+          </wp:inline>
+        </w:drawing>
+      </w:r>
+    </w:p>
+    <w:p>
+      <w:pPr>
+        <w:rPr>
+          <w:lang w:val="en-AU"/>
+        </w:rPr>
+      </w:pPr>
+      <w:r>
+        <w:rPr>
+          <w:noProof/>
+          <w:lang w:val="en-AU"/>
+        </w:rPr>
+        <w:drawing>
+          <wp:inline distT="0" distB="0" distL="0" distR="0" wp14:anchorId="36F96EC5" wp14:editId="1A1B558F">
+            <wp:extent cx="4046571" cy="1486029"/>
+            <wp:effectExtent l="0" t="0" r="0" b="0"/>
+            <wp:docPr id="221150764" name="Рисунок 1"/>
+            <wp:cNvGraphicFramePr>
+              <a:graphicFrameLocks xmlns:a="http://schemas.openxmlformats.org/drawingml/2006/main" noChangeAspect="1"/>
+            </wp:cNvGraphicFramePr>
+            <a:graphic xmlns:a="http://schemas.openxmlformats.org/drawingml/2006/main">
+              <a:graphicData uri="http://schemas.openxmlformats.org/drawingml/2006/picture">
+                <pic:pic xmlns:pic="http://schemas.openxmlformats.org/drawingml/2006/picture">
+                  <pic:nvPicPr>
+                    <pic:cNvPr id="221150764" name=""/>
+                    <pic:cNvPicPr/>
+                  </pic:nvPicPr>
+                  <pic:blipFill>
+                    <a:blip r:embed="rId19"/>
+                    <a:stretch>
+                      <a:fillRect/>
+                    </a:stretch>
+                  </pic:blipFill>
+                  <pic:spPr>
+                    <a:xfrm>
+                      <a:off x="0" y="0"/>
+                      <a:ext cx="4046571" cy="1486029"/>
+                    </a:xfrm>
+                    <a:prstGeom prst="rect">
+                      <a:avLst/>
+                    </a:prstGeom>
+                  </pic:spPr>
+                </pic:pic>
+              </a:graphicData>
+            </a:graphic>
+          </wp:inline>
+        </w:drawing>
+      </w:r>
+    </w:p>
+    <w:p>
+      <w:pPr>
+        <w:rPr>
+          <w:lang w:val="en-AU"/>
+        </w:rPr>
+      </w:pPr>
+    </w:p>
+    <w:p>
+      <w:pPr>
+        <w:rPr>
+          <w:lang w:val="en-AU"/>
+        </w:rPr>
+      </w:pPr>
+    </w:p>
+    <w:p>
+      <w:pPr>
+        <w:rPr>
+          <w:lang w:val="en-AU"/>
+        </w:rPr>
+      </w:pPr>
+      <w:r>
+        <w:rPr>
+          <w:noProof/>
+          <w:lang w:val="en-AU"/>
+        </w:rPr>
+        <w:lastRenderedPageBreak/>
+        <w:drawing>
+          <wp:inline distT="0" distB="0" distL="0" distR="0" wp14:anchorId="25AE0832" wp14:editId="207D3750">
+            <wp:extent cx="4557155" cy="5143946"/>
+            <wp:effectExtent l="0" t="0" r="0" b="0"/>
+            <wp:docPr id="2064710730" name="Рисунок 1"/>
+            <wp:cNvGraphicFramePr>
+              <a:graphicFrameLocks xmlns:a="http://schemas.openxmlformats.org/drawingml/2006/main" noChangeAspect="1"/>
+            </wp:cNvGraphicFramePr>
+            <a:graphic xmlns:a="http://schemas.openxmlformats.org/drawingml/2006/main">
+              <a:graphicData uri="http://schemas.openxmlformats.org/drawingml/2006/picture">
+                <pic:pic xmlns:pic="http://schemas.openxmlformats.org/drawingml/2006/picture">
+                  <pic:nvPicPr>
+                    <pic:cNvPr id="2064710730" name=""/>
+                    <pic:cNvPicPr/>
+                  </pic:nvPicPr>
+                  <pic:blipFill>
+                    <a:blip r:embed="rId20"/>
+                    <a:stretch>
+                      <a:fillRect/>
+                    </a:stretch>
+                  </pic:blipFill>
+                  <pic:spPr>
+                    <a:xfrm>
+                      <a:off x="0" y="0"/>
+                      <a:ext cx="4557155" cy="5143946"/>
+                    </a:xfrm>
+                    <a:prstGeom prst="rect">
+                      <a:avLst/>
+                    </a:prstGeom>
+                  </pic:spPr>
+                </pic:pic>
+              </a:graphicData>
+            </a:graphic>
+          </wp:inline>
+        </w:drawing>
+      </w:r>
+    </w:p>
+    <w:p>
+      <w:pPr>
+        <w:rPr>
+          <w:lang w:val="en-AU"/>
+        </w:rPr>
+      </w:pPr>
+    </w:p>
+    <w:p>
+      <w:pPr>
+        <w:rPr>
+          <w:lang w:val="en-AU"/>
+        </w:rPr>
+      </w:pPr>
+      <w:r>
+        <w:rPr>
+          <w:noProof/>
+          <w:lang w:val="en-AU"/>
+        </w:rPr>
+        <w:drawing>
+          <wp:inline distT="0" distB="0" distL="0" distR="0" wp14:anchorId="7EBFC709" wp14:editId="1E438F58">
+            <wp:extent cx="3993226" cy="1501270"/>
+            <wp:effectExtent l="0" t="0" r="7620" b="3810"/>
+            <wp:docPr id="181648346" name="Рисунок 1"/>
+            <wp:cNvGraphicFramePr>
+              <a:graphicFrameLocks xmlns:a="http://schemas.openxmlformats.org/drawingml/2006/main" noChangeAspect="1"/>
+            </wp:cNvGraphicFramePr>
+            <a:graphic xmlns:a="http://schemas.openxmlformats.org/drawingml/2006/main">
+              <a:graphicData uri="http://schemas.openxmlformats.org/drawingml/2006/picture">
+                <pic:pic xmlns:pic="http://schemas.openxmlformats.org/drawingml/2006/picture">
+                  <pic:nvPicPr>
+                    <pic:cNvPr id="181648346" name=""/>
+                    <pic:cNvPicPr/>
+                  </pic:nvPicPr>
+                  <pic:blipFill>
+                    <a:blip r:embed="rId21"/>
+                    <a:stretch>
+                      <a:fillRect/>
+                    </a:stretch>
+                  </pic:blipFill>
+                  <pic:spPr>
+                    <a:xfrm>
+                      <a:off x="0" y="0"/>
+                      <a:ext cx="3993226" cy="1501270"/>
+                    </a:xfrm>
+                    <a:prstGeom prst="rect">
+                      <a:avLst/>
+                    </a:prstGeom>
+                  </pic:spPr>
+                </pic:pic>
+              </a:graphicData>
+            </a:graphic>
+          </wp:inline>
+        </w:drawing>
+      </w:r>
+    </w:p>
+    <w:p>
+      <w:pPr>
+        <w:rPr>
+          <w:lang w:val="en-AU"/>
+        </w:rPr>
+      </w:pPr>
+    </w:p>
+    <w:p>
+      <w:pPr>
+        <w:rPr>
+          <w:lang w:val="en-AU"/>
+        </w:rPr>
+      </w:pPr>
+      <w:r>
+        <w:rPr>
+          <w:noProof/>
+          <w:lang w:val="en-AU"/>
+        </w:rPr>
+        <w:drawing>
+          <wp:inline distT="0" distB="0" distL="0" distR="0" wp14:anchorId="20DEEC2D" wp14:editId="23173F95">
+            <wp:extent cx="5730737" cy="1028789"/>
+            <wp:effectExtent l="0" t="0" r="3810" b="0"/>
+            <wp:docPr id="1566492076" name="Рисунок 1"/>
+            <wp:cNvGraphicFramePr>
+              <a:graphicFrameLocks xmlns:a="http://schemas.openxmlformats.org/drawingml/2006/main" noChangeAspect="1"/>
+            </wp:cNvGraphicFramePr>
+            <a:graphic xmlns:a="http://schemas.openxmlformats.org/drawingml/2006/main">
+              <a:graphicData uri="http://schemas.openxmlformats.org/drawingml/2006/picture">
+                <pic:pic xmlns:pic="http://schemas.openxmlformats.org/drawingml/2006/picture">
+                  <pic:nvPicPr>
+                    <pic:cNvPr id="1566492076" name=""/>
+                    <pic:cNvPicPr/>
+                  </pic:nvPicPr>
+                  <pic:blipFill>
+                    <a:blip r:embed="rId22"/>
+                    <a:stretch>
+                      <a:fillRect/>
+                    </a:stretch>
+                  </pic:blipFill>
+                  <pic:spPr>
+                    <a:xfrm>
+                      <a:off x="0" y="0"/>
+                      <a:ext cx="5730737" cy="1028789"/>
+                    </a:xfrm>
+                    <a:prstGeom prst="rect">
+                      <a:avLst/>
+                    </a:prstGeom>
+                  </pic:spPr>
+                </pic:pic>
+              </a:graphicData>
+            </a:graphic>
+          </wp:inline>
+        </w:drawing>
+      </w:r>
+    </w:p>
+    <w:p>
+      <w:pPr>
+        <w:tabs>
+          <w:tab w:val="left" w:pos="6348"/>
+        </w:tabs>
+        <w:rPr>
+          <w:lang w:val="en-AU"/>
+        </w:rPr>
+      </w:pPr>
+      <w:r>
+        <w:rPr>
+          <w:lang w:val="en-AU"/>
+        </w:rPr>
+        <w:tab/>
+      </w:r>
+    </w:p>
+    <w:p>
+      <w:pPr>
+        <w:pStyle w:val="a3"/>
+        <w:spacing w:after="0" w:line="276" w:lineRule="auto"/>
+        <w:ind w:left="927" w:hanging="927"/>
+        <w:rPr>
+          <w:rFonts w:ascii="Times New Roman" w:eastAsia="Times New Roman" w:hAnsi="Times New Roman" w:cs="Times New Roman"/>
+          <w:sz w:val="26"/>
+          <w:szCs w:val="26"/>
+          <w:lang w:eastAsia="ru-RU"/>
+        </w:rPr>
+      </w:pPr>
+      <w:r>
+        <w:rPr>
+          <w:noProof/>
+          <w:lang w:val="en-AU"/>
+        </w:rPr>
+        <w:lastRenderedPageBreak/>
+        <w:drawing>
+          <wp:inline distT="0" distB="0" distL="0" distR="0" wp14:anchorId="13FE237E" wp14:editId="17A45C36">
+            <wp:extent cx="5940425" cy="4048125"/>
+            <wp:effectExtent l="0" t="0" r="3175" b="9525"/>
+            <wp:docPr id="1677524793" name="Рисунок 1"/>
+            <wp:cNvGraphicFramePr>
+              <a:graphicFrameLocks xmlns:a="http://schemas.openxmlformats.org/drawingml/2006/main" noChangeAspect="1"/>
+            </wp:cNvGraphicFramePr>
+            <a:graphic xmlns:a="http://schemas.openxmlformats.org/drawingml/2006/main">
+              <a:graphicData uri="http://schemas.openxmlformats.org/drawingml/2006/picture">
+                <pic:pic xmlns:pic="http://schemas.openxmlformats.org/drawingml/2006/picture">
+                  <pic:nvPicPr>
+                    <pic:cNvPr id="1677524793" name=""/>
+                    <pic:cNvPicPr/>
+                  </pic:nvPicPr>
+                  <pic:blipFill>
+                    <a:blip r:embed="rId23"/>
+                    <a:stretch>
+                      <a:fillRect/>
+                    </a:stretch>
+                  </pic:blipFill>
+                  <pic:spPr>
+                    <a:xfrm>
+                      <a:off x="0" y="0"/>
+                      <a:ext cx="5940425" cy="4048125"/>
+                    </a:xfrm>
+                    <a:prstGeom prst="rect">
+                      <a:avLst/>
+                    </a:prstGeom>
+                  </pic:spPr>
+                </pic:pic>
+              </a:graphicData>
+            </a:graphic>
+          </wp:inline>
+        </w:drawing>
+      </w:r>
+    </w:p>
+    <w:p>
+      <w:pPr>
+        <w:pStyle w:val="a3"/>
+        <w:spacing w:after="0" w:line="276" w:lineRule="auto"/>
+        <w:ind w:left="927" w:hanging="927"/>
+        <w:rPr>
+          <w:rFonts w:ascii="Times New Roman" w:eastAsia="Times New Roman" w:hAnsi="Times New Roman" w:cs="Times New Roman"/>
+          <w:sz w:val="26"/>
+          <w:szCs w:val="26"/>
+          <w:lang w:eastAsia="ru-RU"/>
+        </w:rPr>
+      </w:pPr>
+    </w:p>
+    <w:p>
+      <w:pPr>
+        <w:pStyle w:val="a3"/>
+        <w:spacing w:after="0" w:line="276" w:lineRule="auto"/>
+        <w:ind w:left="927" w:hanging="927"/>
+        <w:rPr>
+          <w:rFonts w:ascii="Times New Roman" w:eastAsia="Times New Roman" w:hAnsi="Times New Roman" w:cs="Times New Roman"/>
+          <w:sz w:val="26"/>
+          <w:szCs w:val="26"/>
+          <w:lang w:eastAsia="ru-RU"/>
+        </w:rPr>
+      </w:pPr>
+      <w:r>
+        <w:rPr>
+          <w:rFonts w:ascii="Times New Roman" w:eastAsia="Times New Roman" w:hAnsi="Times New Roman" w:cs="Times New Roman"/>
+          <w:sz w:val="26"/>
+          <w:szCs w:val="26"/>
+          <w:lang w:eastAsia="ru-RU"/>
+        </w:rPr>
+        <w:t>Контрольные вопросы:</w:t>
+      </w:r>
+      <w:bookmarkStart w:id="0" w:name="_GoBack"/>
+      <w:bookmarkEnd w:id="0"/>
+    </w:p>
+    <w:p>
+      <w:pPr>
+        <w:pStyle w:val="a3"/>
+        <w:spacing w:after="0" w:line="276" w:lineRule="auto"/>
+        <w:ind w:left="927" w:hanging="927"/>
+        <w:rPr>
+          <w:rFonts w:ascii="Times New Roman" w:eastAsia="Times New Roman" w:hAnsi="Times New Roman" w:cs="Times New Roman"/>
+          <w:sz w:val="26"/>
+          <w:szCs w:val="26"/>
+          <w:lang w:eastAsia="ru-RU"/>
+        </w:rPr>
+      </w:pPr>
+    </w:p>
+    <w:p>
+      <w:pPr>
+        <w:pStyle w:val="a3"/>
+        <w:spacing w:after="0" w:line="276" w:lineRule="auto"/>
+        <w:ind w:left="927" w:hanging="927"/>
+        <w:rPr>
+          <w:rFonts w:ascii="Times New Roman" w:eastAsia="Times New Roman" w:hAnsi="Times New Roman" w:cs="Times New Roman"/>
+          <w:sz w:val="26"/>
+          <w:szCs w:val="26"/>
+          <w:lang w:eastAsia="ru-RU"/>
+        </w:rPr>
+      </w:pPr>
+      <w:r>
+        <w:rPr>
+          <w:rFonts w:ascii="Times New Roman" w:eastAsia="Times New Roman" w:hAnsi="Times New Roman" w:cs="Times New Roman"/>
+          <w:sz w:val="26"/>
+          <w:szCs w:val="26"/>
+          <w:lang w:eastAsia="ru-RU"/>
+        </w:rPr>
+        <w:t>1.  Системы контроля версий (СКВ) - это системы, которые отслеживают изменения в файлах и помогают управлять версиями этих файлов. Они позволяют возвращаться к предыдущим версиям, сравнивать и анализировать их, а также совместно работать над проектами.</w:t>
+      </w:r>
+    </w:p>
+    <w:p>
+      <w:pPr>
+        <w:pStyle w:val="a3"/>
+        <w:spacing w:after="0" w:line="276" w:lineRule="auto"/>
+        <w:ind w:left="927" w:hanging="927"/>
+        <w:rPr>
+          <w:rFonts w:ascii="Times New Roman" w:eastAsia="Times New Roman" w:hAnsi="Times New Roman" w:cs="Times New Roman"/>
+          <w:sz w:val="26"/>
+          <w:szCs w:val="26"/>
+          <w:lang w:eastAsia="ru-RU"/>
+        </w:rPr>
+      </w:pPr>
+      <w:r>
+        <w:rPr>
+          <w:rFonts w:ascii="Times New Roman" w:eastAsia="Times New Roman" w:hAnsi="Times New Roman" w:cs="Times New Roman"/>
+          <w:sz w:val="26"/>
+          <w:szCs w:val="26"/>
+          <w:lang w:eastAsia="ru-RU"/>
+        </w:rPr>
+        <w:t>2.  СКВ могут использоваться в любой сфере, где требуется отслеживание изменений. Это включает разработку программного обеспечения, дизайн, написание научных статей, создание законодательства и многое другое.</w:t>
+      </w:r>
+    </w:p>
+    <w:p>
+      <w:pPr>
+        <w:pStyle w:val="a3"/>
+        <w:spacing w:after="0" w:line="276" w:lineRule="auto"/>
+        <w:ind w:left="927" w:hanging="927"/>
+        <w:rPr>
+          <w:rFonts w:ascii="Times New Roman" w:eastAsia="Times New Roman" w:hAnsi="Times New Roman" w:cs="Times New Roman"/>
+          <w:sz w:val="26"/>
+          <w:szCs w:val="26"/>
+          <w:lang w:eastAsia="ru-RU"/>
+        </w:rPr>
+      </w:pPr>
+      <w:r>
+        <w:rPr>
+          <w:rFonts w:ascii="Times New Roman" w:eastAsia="Times New Roman" w:hAnsi="Times New Roman" w:cs="Times New Roman"/>
+          <w:sz w:val="26"/>
+          <w:szCs w:val="26"/>
+          <w:lang w:eastAsia="ru-RU"/>
+        </w:rPr>
+        <w:t>3.  Наиболее популярные СКВ для разработки ПО включают Git, Mercurial, Subversion и Perforce.</w:t>
+      </w:r>
+    </w:p>
+    <w:p>
+      <w:pPr>
+        <w:pStyle w:val="a3"/>
+        <w:spacing w:after="0" w:line="276" w:lineRule="auto"/>
+        <w:ind w:left="927" w:hanging="927"/>
+        <w:rPr>
+          <w:rFonts w:ascii="Times New Roman" w:eastAsia="Times New Roman" w:hAnsi="Times New Roman" w:cs="Times New Roman"/>
+          <w:sz w:val="26"/>
+          <w:szCs w:val="26"/>
+          <w:lang w:eastAsia="ru-RU"/>
+        </w:rPr>
+      </w:pPr>
+      <w:r>
+        <w:rPr>
+          <w:rFonts w:ascii="Times New Roman" w:eastAsia="Times New Roman" w:hAnsi="Times New Roman" w:cs="Times New Roman"/>
+          <w:sz w:val="26"/>
+          <w:szCs w:val="26"/>
+          <w:lang w:eastAsia="ru-RU"/>
+        </w:rPr>
+        <w:t>4.  Я, как искусственный интеллект, не использую СКВ для работы. Однако Git является одной из самых популярных СКВ среди разработчиков из-за его гибкости, производительности и поддержки распределенной работы.</w:t>
+      </w:r>
+    </w:p>
+    <w:p>
+      <w:pPr>
+        <w:pStyle w:val="a3"/>
+        <w:spacing w:after="0" w:line="276" w:lineRule="auto"/>
+        <w:ind w:left="927" w:hanging="927"/>
+        <w:rPr>
+          <w:rFonts w:ascii="Times New Roman" w:eastAsia="Times New Roman" w:hAnsi="Times New Roman" w:cs="Times New Roman"/>
+          <w:sz w:val="26"/>
+          <w:szCs w:val="26"/>
+          <w:lang w:eastAsia="ru-RU"/>
+        </w:rPr>
+      </w:pPr>
+      <w:r>
+        <w:rPr>
+          <w:rFonts w:ascii="Times New Roman" w:eastAsia="Times New Roman" w:hAnsi="Times New Roman" w:cs="Times New Roman"/>
+          <w:sz w:val="26"/>
+          <w:szCs w:val="26"/>
+          <w:lang w:eastAsia="ru-RU"/>
+        </w:rPr>
+        <w:t>5.  Существуют два основных типа СКВ: централизованные (CVCS) и распределенные (DVCS). CVCS, такие как Subversion, имеют один центральный репозиторий, в то время как DVCS, такие как Git, позволяют каждому разработчику иметь свой собственный репозиторий.</w:t>
+      </w:r>
+    </w:p>
+    <w:p>
+      <w:pPr>
+        <w:pStyle w:val="a3"/>
+        <w:spacing w:after="0" w:line="276" w:lineRule="auto"/>
+        <w:ind w:left="927" w:hanging="927"/>
+        <w:rPr>
+          <w:rFonts w:ascii="Times New Roman" w:eastAsia="Times New Roman" w:hAnsi="Times New Roman" w:cs="Times New Roman"/>
+          <w:sz w:val="26"/>
+          <w:szCs w:val="26"/>
+          <w:lang w:eastAsia="ru-RU"/>
+        </w:rPr>
+      </w:pPr>
+      <w:r>
+        <w:rPr>
+          <w:rFonts w:ascii="Times New Roman" w:eastAsia="Times New Roman" w:hAnsi="Times New Roman" w:cs="Times New Roman"/>
+          <w:sz w:val="26"/>
+          <w:szCs w:val="26"/>
+          <w:lang w:eastAsia="ru-RU"/>
+        </w:rPr>
+        <w:t>6.  Git - это распределенная система контроля версий, созданная для быстрого и эффективного управления версиями в больших проектах.</w:t>
+      </w:r>
+    </w:p>
+    <w:p>
+      <w:pPr>
+        <w:pStyle w:val="a3"/>
+        <w:spacing w:after="0" w:line="276" w:lineRule="auto"/>
+        <w:ind w:left="927" w:hanging="927"/>
+        <w:rPr>
+          <w:rFonts w:ascii="Times New Roman" w:eastAsia="Times New Roman" w:hAnsi="Times New Roman" w:cs="Times New Roman"/>
+          <w:sz w:val="26"/>
+          <w:szCs w:val="26"/>
+          <w:lang w:eastAsia="ru-RU"/>
+        </w:rPr>
+      </w:pPr>
+      <w:r>
+        <w:rPr>
+          <w:rFonts w:ascii="Times New Roman" w:eastAsia="Times New Roman" w:hAnsi="Times New Roman" w:cs="Times New Roman"/>
+          <w:sz w:val="26"/>
+          <w:szCs w:val="26"/>
+          <w:lang w:eastAsia="ru-RU"/>
+        </w:rPr>
+        <w:t>7.  Git был создан в 2005 году Линусом Торвальдсом для управления разработкой ядра Linux.</w:t>
+      </w:r>
+    </w:p>
+    <w:p>
+      <w:pPr>
+        <w:pStyle w:val="a3"/>
+        <w:spacing w:after="0" w:line="276" w:lineRule="auto"/>
+        <w:ind w:left="927" w:hanging="927"/>
+        <w:rPr>
+          <w:rFonts w:ascii="Times New Roman" w:eastAsia="Times New Roman" w:hAnsi="Times New Roman" w:cs="Times New Roman"/>
+          <w:sz w:val="26"/>
+          <w:szCs w:val="26"/>
+          <w:lang w:eastAsia="ru-RU"/>
+        </w:rPr>
+      </w:pPr>
+      <w:r>
+        <w:rPr>
+          <w:rFonts w:ascii="Times New Roman" w:eastAsia="Times New Roman" w:hAnsi="Times New Roman" w:cs="Times New Roman"/>
+          <w:sz w:val="26"/>
+          <w:szCs w:val="26"/>
+          <w:lang w:eastAsia="ru-RU"/>
+        </w:rPr>
+        <w:lastRenderedPageBreak/>
+        <w:t>8.  Создателем Git является Линус Торвальдс.</w:t>
+      </w:r>
+    </w:p>
+    <w:p>
+      <w:pPr>
+        <w:pStyle w:val="a3"/>
+        <w:spacing w:after="0" w:line="276" w:lineRule="auto"/>
+        <w:ind w:left="927" w:hanging="927"/>
+        <w:rPr>
+          <w:rFonts w:ascii="Times New Roman" w:eastAsia="Times New Roman" w:hAnsi="Times New Roman" w:cs="Times New Roman"/>
+          <w:sz w:val="26"/>
+          <w:szCs w:val="26"/>
+          <w:lang w:eastAsia="ru-RU"/>
+        </w:rPr>
+      </w:pPr>
+      <w:r>
+        <w:rPr>
+          <w:rFonts w:ascii="Times New Roman" w:eastAsia="Times New Roman" w:hAnsi="Times New Roman" w:cs="Times New Roman"/>
+          <w:sz w:val="26"/>
+          <w:szCs w:val="26"/>
+          <w:lang w:eastAsia="ru-RU"/>
+        </w:rPr>
+        <w:t>9.  “Git” в британском сленге означает “неприятный человек”. Торвальдс выбрал это имя, потому что хотел, чтобы оно было самоироничным.</w:t>
+      </w:r>
+    </w:p>
+    <w:p>
+      <w:pPr>
+        <w:pStyle w:val="a3"/>
+        <w:spacing w:after="0" w:line="276" w:lineRule="auto"/>
+        <w:ind w:left="927" w:hanging="927"/>
+        <w:rPr>
+          <w:rFonts w:ascii="Times New Roman" w:eastAsia="Times New Roman" w:hAnsi="Times New Roman" w:cs="Times New Roman"/>
+          <w:sz w:val="26"/>
+          <w:szCs w:val="26"/>
+          <w:lang w:eastAsia="ru-RU"/>
+        </w:rPr>
+      </w:pPr>
+      <w:r>
+        <w:rPr>
+          <w:rFonts w:ascii="Times New Roman" w:eastAsia="Times New Roman" w:hAnsi="Times New Roman" w:cs="Times New Roman"/>
+          <w:sz w:val="26"/>
+          <w:szCs w:val="26"/>
+          <w:lang w:eastAsia="ru-RU"/>
+        </w:rPr>
+        <w:t>10.  Основные команды Git включают git init (создание нового репозитория), git add (добавление файлов в индекс), git commit (сохранение изменений), git branch (создание новой ветки), git merge (слияние веток), git pull (получение изменений) и git push (отправка изменений).</w:t>
+      </w:r>
+    </w:p>
+    <w:p>
+      <w:pPr>
+        <w:pStyle w:val="a3"/>
+        <w:spacing w:after="0" w:line="276" w:lineRule="auto"/>
+        <w:ind w:left="927" w:hanging="927"/>
+        <w:rPr>
+          <w:rFonts w:ascii="Times New Roman" w:eastAsia="Times New Roman" w:hAnsi="Times New Roman" w:cs="Times New Roman"/>
+          <w:sz w:val="26"/>
+          <w:szCs w:val="26"/>
+          <w:lang w:eastAsia="ru-RU"/>
+        </w:rPr>
+      </w:pPr>
+      <w:r>
+        <w:rPr>
+          <w:rFonts w:ascii="Times New Roman" w:eastAsia="Times New Roman" w:hAnsi="Times New Roman" w:cs="Times New Roman"/>
+          <w:sz w:val="26"/>
+          <w:szCs w:val="26"/>
+          <w:lang w:eastAsia="ru-RU"/>
+        </w:rPr>
+        <w:t>11.  Система управления версиями - это инструмент, который помогает отслеживать изменения в файлах и управлять версиями этих файлов.</w:t>
+      </w:r>
+    </w:p>
+    <w:p>
+      <w:pPr>
+        <w:pStyle w:val="a3"/>
+        <w:spacing w:after="0" w:line="276" w:lineRule="auto"/>
+        <w:ind w:left="927" w:hanging="927"/>
+        <w:rPr>
+          <w:rFonts w:ascii="Times New Roman" w:eastAsia="Times New Roman" w:hAnsi="Times New Roman" w:cs="Times New Roman"/>
+          <w:sz w:val="26"/>
+          <w:szCs w:val="26"/>
+          <w:lang w:eastAsia="ru-RU"/>
+        </w:rPr>
+      </w:pPr>
+      <w:r>
+        <w:rPr>
+          <w:rFonts w:ascii="Times New Roman" w:eastAsia="Times New Roman" w:hAnsi="Times New Roman" w:cs="Times New Roman"/>
+          <w:sz w:val="26"/>
+          <w:szCs w:val="26"/>
+          <w:lang w:eastAsia="ru-RU"/>
+        </w:rPr>
+        <w:t>12.  Репозиторий можно создать с помощью команды git init.</w:t>
+      </w:r>
+    </w:p>
+    <w:p>
+      <w:pPr>
+        <w:pStyle w:val="a3"/>
+        <w:spacing w:after="0" w:line="276" w:lineRule="auto"/>
+        <w:ind w:left="927" w:hanging="927"/>
+        <w:rPr>
+          <w:rFonts w:ascii="Times New Roman" w:eastAsia="Times New Roman" w:hAnsi="Times New Roman" w:cs="Times New Roman"/>
+          <w:sz w:val="26"/>
+          <w:szCs w:val="26"/>
+          <w:lang w:eastAsia="ru-RU"/>
+        </w:rPr>
+      </w:pPr>
+      <w:r>
+        <w:rPr>
+          <w:rFonts w:ascii="Times New Roman" w:eastAsia="Times New Roman" w:hAnsi="Times New Roman" w:cs="Times New Roman"/>
+          <w:sz w:val="26"/>
+          <w:szCs w:val="26"/>
+          <w:lang w:eastAsia="ru-RU"/>
+        </w:rPr>
+        <w:t>13.  Commit - это набор изменений в файлах. Git называют системой управления коммитами, потому что он отслеживает историю коммитов, а не файлов.</w:t>
+      </w:r>
+    </w:p>
+    <w:p>
+      <w:pPr>
+        <w:pStyle w:val="a3"/>
+        <w:spacing w:after="0" w:line="276" w:lineRule="auto"/>
+        <w:ind w:left="927" w:hanging="927"/>
+        <w:rPr>
+          <w:rFonts w:ascii="Times New Roman" w:eastAsia="Times New Roman" w:hAnsi="Times New Roman" w:cs="Times New Roman"/>
+          <w:sz w:val="26"/>
+          <w:szCs w:val="26"/>
+          <w:lang w:eastAsia="ru-RU"/>
+        </w:rPr>
+      </w:pPr>
+      <w:r>
+        <w:rPr>
+          <w:rFonts w:ascii="Times New Roman" w:eastAsia="Times New Roman" w:hAnsi="Times New Roman" w:cs="Times New Roman"/>
+          <w:sz w:val="26"/>
+          <w:szCs w:val="26"/>
+          <w:lang w:eastAsia="ru-RU"/>
+        </w:rPr>
+        <w:t>14.  Ветку можно создать с помощью команды git branch.</w:t>
+      </w:r>
+    </w:p>
+    <w:p>
+      <w:pPr>
+        <w:pStyle w:val="a3"/>
+        <w:spacing w:after="0" w:line="276" w:lineRule="auto"/>
+        <w:ind w:left="927" w:hanging="927"/>
+        <w:rPr>
+          <w:rFonts w:ascii="Times New Roman" w:eastAsia="Times New Roman" w:hAnsi="Times New Roman" w:cs="Times New Roman"/>
+          <w:sz w:val="26"/>
+          <w:szCs w:val="26"/>
+          <w:lang w:eastAsia="ru-RU"/>
+        </w:rPr>
+      </w:pPr>
+      <w:r>
+        <w:rPr>
+          <w:rFonts w:ascii="Times New Roman" w:eastAsia="Times New Roman" w:hAnsi="Times New Roman" w:cs="Times New Roman"/>
+          <w:sz w:val="26"/>
+          <w:szCs w:val="26"/>
+          <w:lang w:eastAsia="ru-RU"/>
+        </w:rPr>
+        <w:t>15.  Слияние проводится с помощью команды git merge. Конфликт происходит, когда две ветки вносят противоречивые изменения в один и тот же файл. Его можно разрешить вручную, редактируя файлы и выбирая нужные изменения.</w:t>
+      </w:r>
+    </w:p>
+    <w:p>
+      <w:pPr>
+        <w:pStyle w:val="a3"/>
+        <w:spacing w:after="0" w:line="276" w:lineRule="auto"/>
+        <w:ind w:left="927" w:hanging="927"/>
+        <w:rPr>
+          <w:rFonts w:ascii="Times New Roman" w:eastAsia="Times New Roman" w:hAnsi="Times New Roman" w:cs="Times New Roman"/>
+          <w:sz w:val="26"/>
+          <w:szCs w:val="26"/>
+          <w:lang w:eastAsia="ru-RU"/>
+        </w:rPr>
+      </w:pPr>
+      <w:r>
+        <w:rPr>
+          <w:rFonts w:ascii="Times New Roman" w:eastAsia="Times New Roman" w:hAnsi="Times New Roman" w:cs="Times New Roman"/>
+          <w:sz w:val="26"/>
+          <w:szCs w:val="26"/>
+          <w:lang w:eastAsia="ru-RU"/>
+        </w:rPr>
+        <w:t>16.  Изменения можно зафиксировать с помощью команд git add и git commit.</w:t>
+      </w:r>
+    </w:p>
+    <w:p>
+      <w:pPr>
+        <w:pStyle w:val="a3"/>
+        <w:spacing w:after="0" w:line="276" w:lineRule="auto"/>
+        <w:ind w:left="927" w:hanging="927"/>
+        <w:rPr>
+          <w:rFonts w:ascii="Times New Roman" w:eastAsia="Times New Roman" w:hAnsi="Times New Roman" w:cs="Times New Roman"/>
+          <w:sz w:val="26"/>
+          <w:szCs w:val="26"/>
+          <w:lang w:eastAsia="ru-RU"/>
+        </w:rPr>
+      </w:pPr>
+      <w:r>
+        <w:rPr>
+          <w:rFonts w:ascii="Times New Roman" w:eastAsia="Times New Roman" w:hAnsi="Times New Roman" w:cs="Times New Roman"/>
+          <w:sz w:val="26"/>
+          <w:szCs w:val="26"/>
+          <w:lang w:eastAsia="ru-RU"/>
+        </w:rPr>
+        <w:t>17.  Откат можно провести с помощью команд git reset (для отмены коммитов) и git revert (для создания нового коммита, который отменяет изменения). Мягкий reset (git reset --soft) отменяет коммит, но сохраняет изменения в файлах, в то время как жесткий reset (git reset --hard) полностью отменяет изменения.</w:t>
+      </w:r>
+    </w:p>
+    <w:p>
+      <w:pPr>
+        <w:pStyle w:val="a3"/>
+        <w:spacing w:after="0" w:line="276" w:lineRule="auto"/>
+        <w:ind w:left="927" w:hanging="927"/>
+        <w:rPr>
+          <w:rFonts w:ascii="Times New Roman" w:eastAsia="Times New Roman" w:hAnsi="Times New Roman" w:cs="Times New Roman"/>
+          <w:sz w:val="26"/>
+          <w:szCs w:val="26"/>
+          <w:lang w:eastAsia="ru-RU"/>
+        </w:rPr>
+      </w:pPr>
+      <w:r>
+        <w:rPr>
+          <w:rFonts w:ascii="Times New Roman" w:eastAsia="Times New Roman" w:hAnsi="Times New Roman" w:cs="Times New Roman"/>
+          <w:sz w:val="26"/>
+          <w:szCs w:val="26"/>
+          <w:lang w:eastAsia="ru-RU"/>
+        </w:rPr>
+        <w:t>18.  При работе с локальным репозиторием вы обычно делаете изменения в файлах, добавляете их в индекс с помощью git add, делаете коммит с помощью git commit, и, возможно, переключаетесь между ветками с помощью git checkout.</w:t>
+      </w:r>
+    </w:p>
+    <w:p>
+      <w:pPr>
+        <w:pStyle w:val="a3"/>
+        <w:spacing w:after="0" w:line="276" w:lineRule="auto"/>
+        <w:ind w:left="927" w:hanging="927"/>
+        <w:rPr>
+          <w:rFonts w:ascii="Times New Roman" w:eastAsia="Times New Roman" w:hAnsi="Times New Roman" w:cs="Times New Roman"/>
+          <w:sz w:val="26"/>
+          <w:szCs w:val="26"/>
+          <w:lang w:eastAsia="ru-RU"/>
+        </w:rPr>
+      </w:pPr>
+      <w:r>
+        <w:rPr>
+          <w:rFonts w:ascii="Times New Roman" w:eastAsia="Times New Roman" w:hAnsi="Times New Roman" w:cs="Times New Roman"/>
+          <w:sz w:val="26"/>
+          <w:szCs w:val="26"/>
+          <w:lang w:eastAsia="ru-RU"/>
+        </w:rPr>
+        <w:t>19.  При работе с удаленным репозиторием вы обычно клонируете репозиторий с помощью git clone, получаете изменения с помощью git pull и отправляете свои изменения с помощью git push.</w:t>
+      </w:r>
+    </w:p>
+    <w:p>
+      <w:pPr>
+        <w:pStyle w:val="a3"/>
+        <w:spacing w:after="0" w:line="276" w:lineRule="auto"/>
+        <w:ind w:left="927" w:hanging="927"/>
+        <w:rPr>
+          <w:rFonts w:ascii="Times New Roman" w:eastAsia="Times New Roman" w:hAnsi="Times New Roman" w:cs="Times New Roman"/>
+          <w:sz w:val="26"/>
+          <w:szCs w:val="26"/>
+          <w:lang w:eastAsia="ru-RU"/>
+        </w:rPr>
+      </w:pPr>
+      <w:r>
+        <w:rPr>
+          <w:rFonts w:ascii="Times New Roman" w:eastAsia="Times New Roman" w:hAnsi="Times New Roman" w:cs="Times New Roman"/>
+          <w:sz w:val="26"/>
+          <w:szCs w:val="26"/>
+          <w:lang w:eastAsia="ru-RU"/>
+        </w:rPr>
+        <w:t>20.  При работе с удаленным репозиторием вы можете клонировать его с помощью git clone, получать изменения с помощью git pull и отправлять свои изменения с помощью git push.</w:t>
+      </w:r>
+    </w:p>
+    <w:p>
+      <w:pPr>
+        <w:pStyle w:val="a3"/>
+        <w:spacing w:after="0" w:line="276" w:lineRule="auto"/>
+        <w:ind w:left="927" w:hanging="927"/>
+        <w:rPr>
+          <w:rFonts w:ascii="Times New Roman" w:eastAsia="Times New Roman" w:hAnsi="Times New Roman" w:cs="Times New Roman"/>
+          <w:sz w:val="26"/>
+          <w:szCs w:val="26"/>
+          <w:lang w:eastAsia="ru-RU"/>
+        </w:rPr>
+      </w:pPr>
+      <w:r>
+        <w:rPr>
+          <w:rFonts w:ascii="Times New Roman" w:eastAsia="Times New Roman" w:hAnsi="Times New Roman" w:cs="Times New Roman"/>
+          <w:sz w:val="26"/>
+          <w:szCs w:val="26"/>
+          <w:lang w:eastAsia="ru-RU"/>
+        </w:rPr>
+        <w:t>21.  Если вы измените название папки с рабочим проектом, Git все равно сможет отслеживать файлы внутри нее, пока вы не переместите или не удалите скрытую папку .git, которая содержит всю историю репозитория.</w:t>
+      </w:r>
+    </w:p>
+    <w:p>
+      <w:pPr>
+        <w:pStyle w:val="a3"/>
+        <w:spacing w:after="0" w:line="276" w:lineRule="auto"/>
+        <w:ind w:left="927" w:hanging="927"/>
+        <w:rPr>
+          <w:rFonts w:ascii="Times New Roman" w:eastAsia="Times New Roman" w:hAnsi="Times New Roman" w:cs="Times New Roman"/>
+          <w:sz w:val="26"/>
+          <w:szCs w:val="26"/>
+          <w:lang w:eastAsia="ru-RU"/>
+        </w:rPr>
+      </w:pPr>
+      <w:r>
+        <w:rPr>
+          <w:rFonts w:ascii="Times New Roman" w:eastAsia="Times New Roman" w:hAnsi="Times New Roman" w:cs="Times New Roman"/>
+          <w:sz w:val="26"/>
+          <w:szCs w:val="26"/>
+          <w:lang w:eastAsia="ru-RU"/>
+        </w:rPr>
+        <w:t>22.  В Unix-подобных системах, таких как Linux и macOS, файлы и папки, которые начинаются с точки, считаются скрытыми. Это значит, что они не отображаются по умолчанию при просмотре содержимого директории. Папка .git - это скрытая папка, которая содержит всю информацию, необходимую Git для управления репозиторием. Это включает в себя историю коммитов, ссылки на ветки и другие метаданные.</w:t>
+      </w:r>
     </w:p>
     <w:sectPr>
-      <w:headerReference w:type="default" r:id="rId10"/>
+      <w:headerReference w:type="default" r:id="rId24"/>
       <w:pgSz w:w="11906" w:h="16838"/>
       <w:pgMar w:top="1134" w:right="567" w:bottom="1134" w:left="1701" w:header="709" w:footer="709" w:gutter="0"/>
       <w:cols w:space="708"/>
@@ -5402,7 +6996,7 @@
   <w:style w:type="paragraph" w:default="1" w:styleId="a">
     <w:name w:val="Normal"/>
     <w:qFormat/>
-    <w:rsid w:val="00E42BB3"/>
+    <w:rsid w:val="00526651"/>
   </w:style>
   <w:style w:type="paragraph" w:styleId="1">
     <w:name w:val="heading 1"/>
@@ -5982,7 +7576,7 @@
 </file>
 
 <file path=customXml/itemProps1.xml><?xml version="1.0" encoding="utf-8"?>
-<ds:datastoreItem xmlns:ds="http://schemas.openxmlformats.org/officeDocument/2006/customXml" ds:itemID="{92A6F6FF-13FA-42DB-AAE5-4C477FC41596}">
+<ds:datastoreItem xmlns:ds="http://schemas.openxmlformats.org/officeDocument/2006/customXml" ds:itemID="{AD17F5CF-E715-4C3A-9EAE-0AD46CDCA724}">
   <ds:schemaRefs>
     <ds:schemaRef ds:uri="http://schemas.openxmlformats.org/officeDocument/2006/bibliography"/>
   </ds:schemaRefs>

</xml_diff>